<commit_message>
docs: include official Pull Request #6 link and screenshot in lab07 report
</commit_message>
<xml_diff>
--- a/Lab07_Akishev_IS-2406.docx
+++ b/Lab07_Akishev_IS-2406.docx
@@ -300,13 +300,13 @@
                 <w:color w:val="0F172A"/>
                 <w:sz w:val="19"/>
               </w:rPr>
-              <w:t>Status Codes Tested:</w:t>
+              <w:t>Pull Request:</w:t>
             </w:r>
             <w:r>
               <w:rPr>
                 <w:sz w:val="19"/>
               </w:rPr>
-              <w:t xml:space="preserve"> 200, 201 + Location, 204, 400, 404, 409</w:t>
+              <w:t xml:space="preserve"> https://github.com/adilkhanakishev/spring-lab-01/pull/6</w:t>
             </w:r>
           </w:p>
         </w:tc>
@@ -2406,6 +2406,64 @@
     </w:p>
     <w:p>
       <w:pPr>
+        <w:spacing w:after="80"/>
+      </w:pPr>
+    </w:p>
+    <w:p>
+      <w:pPr>
+        <w:jc w:val="center"/>
+      </w:pPr>
+    </w:p>
+    <w:p>
+      <w:r>
+        <w:drawing>
+          <wp:inline xmlns:a="http://schemas.openxmlformats.org/drawingml/2006/main" xmlns:pic="http://schemas.openxmlformats.org/drawingml/2006/picture">
+            <wp:extent cx="5943600" cy="2751237"/>
+            <wp:docPr id="4" name="Picture 4"/>
+            <wp:cNvGraphicFramePr>
+              <a:graphicFrameLocks noChangeAspect="1"/>
+            </wp:cNvGraphicFramePr>
+            <a:graphic>
+              <a:graphicData uri="http://schemas.openxmlformats.org/drawingml/2006/picture">
+                <pic:pic>
+                  <pic:nvPicPr>
+                    <pic:cNvPr id="0" name="fig4_github_pr6.png"/>
+                    <pic:cNvPicPr/>
+                  </pic:nvPicPr>
+                  <pic:blipFill>
+                    <a:blip r:embed="rId12"/>
+                    <a:stretch>
+                      <a:fillRect/>
+                    </a:stretch>
+                  </pic:blipFill>
+                  <pic:spPr>
+                    <a:xfrm>
+                      <a:off x="0" y="0"/>
+                      <a:ext cx="5943600" cy="2751237"/>
+                    </a:xfrm>
+                    <a:prstGeom prst="rect"/>
+                  </pic:spPr>
+                </pic:pic>
+              </a:graphicData>
+            </a:graphic>
+          </wp:inline>
+        </w:drawing>
+      </w:r>
+    </w:p>
+    <w:p>
+      <w:pPr>
+        <w:jc w:val="center"/>
+      </w:pPr>
+      <w:r>
+        <w:rPr>
+          <w:i/>
+          <w:sz w:val="17"/>
+        </w:rPr>
+        <w:t>Figure 4: Official GitHub Pull Request #6 (lab07 -&gt; main)</w:t>
+      </w:r>
+    </w:p>
+    <w:p>
+      <w:pPr>
         <w:spacing w:before="280" w:after="80"/>
       </w:pPr>
       <w:r>

</xml_diff>